<commit_message>
Gestion User creation table+fixture
</commit_message>
<xml_diff>
--- a/MCD brouillon.docx
+++ b/MCD brouillon.docx
@@ -2670,6 +2670,7 @@
         <w:rPr>
           <w:rFonts w:eastAsia="Times New Roman"/>
           <w:bCs/>
+          <w:lang w:val="en-US"/>
         </w:rPr>
       </w:pPr>
       <w:proofErr w:type="spellStart"/>
@@ -2678,6 +2679,7 @@
         <w:rPr>
           <w:rFonts w:eastAsia="Times New Roman"/>
           <w:bCs/>
+          <w:lang w:val="en-US"/>
         </w:rPr>
         <w:t>AssocierTarif</w:t>
       </w:r>
@@ -2686,6 +2688,7 @@
         <w:rPr>
           <w:rFonts w:eastAsia="Times New Roman"/>
           <w:bCs/>
+          <w:lang w:val="en-US"/>
         </w:rPr>
         <w:t>(</w:t>
       </w:r>
@@ -2695,6 +2698,7 @@
         <w:rPr>
           <w:rFonts w:eastAsia="Times New Roman"/>
           <w:bCs/>
+          <w:lang w:val="en-US"/>
         </w:rPr>
         <w:t>id_container</w:t>
       </w:r>
@@ -2703,6 +2707,7 @@
         <w:rPr>
           <w:rFonts w:eastAsia="Times New Roman"/>
           <w:bCs/>
+          <w:lang w:val="en-US"/>
         </w:rPr>
         <w:t xml:space="preserve"> PK FK, </w:t>
       </w:r>
@@ -2711,6 +2716,7 @@
         <w:rPr>
           <w:rFonts w:eastAsia="Times New Roman"/>
           <w:bCs/>
+          <w:lang w:val="en-US"/>
         </w:rPr>
         <w:t>id_tarif</w:t>
       </w:r>
@@ -2719,6 +2725,7 @@
         <w:rPr>
           <w:rFonts w:eastAsia="Times New Roman"/>
           <w:bCs/>
+          <w:lang w:val="en-US"/>
         </w:rPr>
         <w:t xml:space="preserve"> PK FK);</w:t>
       </w:r>
@@ -3619,7 +3626,6 @@
           <w:rFonts w:eastAsia="Times New Roman"/>
           <w:bCs/>
           <w:highlight w:val="yellow"/>
-          <w:lang w:val="en-US"/>
         </w:rPr>
       </w:pPr>
       <w:r>
@@ -3637,7 +3643,6 @@
           <w:rFonts w:eastAsia="Times New Roman"/>
           <w:bCs/>
           <w:highlight w:val="yellow"/>
-          <w:lang w:val="en-US"/>
         </w:rPr>
         <w:t>Designation_Container</w:t>
       </w:r>
@@ -3647,46 +3652,23 @@
           <w:rFonts w:eastAsia="Times New Roman"/>
           <w:bCs/>
           <w:highlight w:val="yellow"/>
-          <w:lang w:val="en-US"/>
-        </w:rPr>
-        <w:t xml:space="preserve"> </w:t>
-      </w:r>
-      <w:proofErr w:type="gramStart"/>
-      <w:r>
-        <w:rPr>
-          <w:rFonts w:eastAsia="Times New Roman"/>
-          <w:bCs/>
-          <w:highlight w:val="yellow"/>
-          <w:lang w:val="en-US"/>
-        </w:rPr>
-        <w:t>VARCHAR(</w:t>
-      </w:r>
-      <w:proofErr w:type="gramEnd"/>
-      <w:r>
-        <w:rPr>
-          <w:rFonts w:eastAsia="Times New Roman"/>
-          <w:bCs/>
-          <w:highlight w:val="yellow"/>
-          <w:lang w:val="en-US"/>
-        </w:rPr>
-        <w:t>255)</w:t>
-      </w:r>
-    </w:p>
-    <w:p>
-      <w:pPr>
-        <w:spacing w:after="0"/>
-        <w:rPr>
-          <w:rFonts w:eastAsia="Times New Roman"/>
-          <w:bCs/>
-          <w:lang w:val="en-US"/>
-        </w:rPr>
-      </w:pPr>
-      <w:r>
-        <w:rPr>
-          <w:rFonts w:eastAsia="Times New Roman"/>
-          <w:bCs/>
-          <w:highlight w:val="yellow"/>
-          <w:lang w:val="en-US"/>
+        </w:rPr>
+        <w:t xml:space="preserve"> VARCHAR(255)</w:t>
+      </w:r>
+    </w:p>
+    <w:p>
+      <w:pPr>
+        <w:spacing w:after="0"/>
+        <w:rPr>
+          <w:rFonts w:eastAsia="Times New Roman"/>
+          <w:bCs/>
+        </w:rPr>
+      </w:pPr>
+      <w:r>
+        <w:rPr>
+          <w:rFonts w:eastAsia="Times New Roman"/>
+          <w:bCs/>
+          <w:highlight w:val="yellow"/>
         </w:rPr>
         <w:t>);</w:t>
       </w:r>
@@ -3697,66 +3679,41 @@
         <w:rPr>
           <w:rFonts w:eastAsia="Times New Roman"/>
           <w:bCs/>
-          <w:lang w:val="en-US"/>
-        </w:rPr>
-      </w:pPr>
-    </w:p>
-    <w:p>
-      <w:pPr>
-        <w:spacing w:after="0"/>
-        <w:rPr>
-          <w:rFonts w:eastAsia="Times New Roman"/>
-          <w:bCs/>
-          <w:highlight w:val="yellow"/>
-          <w:lang w:val="en-US"/>
-        </w:rPr>
-      </w:pPr>
-      <w:r>
-        <w:rPr>
-          <w:rFonts w:eastAsia="Times New Roman"/>
-          <w:bCs/>
-          <w:highlight w:val="yellow"/>
-          <w:lang w:val="en-US"/>
-        </w:rPr>
-        <w:t xml:space="preserve">CREATE TABLE </w:t>
-      </w:r>
-      <w:proofErr w:type="spellStart"/>
-      <w:r>
-        <w:rPr>
-          <w:rFonts w:eastAsia="Times New Roman"/>
-          <w:bCs/>
-          <w:highlight w:val="yellow"/>
-          <w:lang w:val="en-US"/>
-        </w:rPr>
-        <w:t>Contenu</w:t>
-      </w:r>
-      <w:proofErr w:type="spellEnd"/>
-      <w:r>
-        <w:rPr>
-          <w:rFonts w:eastAsia="Times New Roman"/>
-          <w:bCs/>
-          <w:highlight w:val="yellow"/>
-          <w:lang w:val="en-US"/>
-        </w:rPr>
-        <w:t xml:space="preserve"> (</w:t>
-      </w:r>
-    </w:p>
-    <w:p>
-      <w:pPr>
-        <w:spacing w:after="0"/>
-        <w:rPr>
-          <w:rFonts w:eastAsia="Times New Roman"/>
-          <w:bCs/>
-          <w:highlight w:val="yellow"/>
-          <w:lang w:val="en-US"/>
-        </w:rPr>
-      </w:pPr>
-      <w:r>
-        <w:rPr>
-          <w:rFonts w:eastAsia="Times New Roman"/>
-          <w:bCs/>
-          <w:highlight w:val="yellow"/>
-          <w:lang w:val="en-US"/>
+        </w:rPr>
+      </w:pPr>
+    </w:p>
+    <w:p>
+      <w:pPr>
+        <w:spacing w:after="0"/>
+        <w:rPr>
+          <w:rFonts w:eastAsia="Times New Roman"/>
+          <w:bCs/>
+          <w:highlight w:val="yellow"/>
+        </w:rPr>
+      </w:pPr>
+      <w:r>
+        <w:rPr>
+          <w:rFonts w:eastAsia="Times New Roman"/>
+          <w:bCs/>
+          <w:highlight w:val="yellow"/>
+        </w:rPr>
+        <w:t>CREATE TABLE Contenu (</w:t>
+      </w:r>
+    </w:p>
+    <w:p>
+      <w:pPr>
+        <w:spacing w:after="0"/>
+        <w:rPr>
+          <w:rFonts w:eastAsia="Times New Roman"/>
+          <w:bCs/>
+          <w:highlight w:val="yellow"/>
+        </w:rPr>
+      </w:pPr>
+      <w:r>
+        <w:rPr>
+          <w:rFonts w:eastAsia="Times New Roman"/>
+          <w:bCs/>
+          <w:highlight w:val="yellow"/>
         </w:rPr>
         <w:t xml:space="preserve">    </w:t>
       </w:r>
@@ -3766,7 +3723,6 @@
           <w:rFonts w:eastAsia="Times New Roman"/>
           <w:bCs/>
           <w:highlight w:val="yellow"/>
-          <w:lang w:val="en-US"/>
         </w:rPr>
         <w:t>Id_Contenu</w:t>
       </w:r>
@@ -3776,7 +3732,6 @@
           <w:rFonts w:eastAsia="Times New Roman"/>
           <w:bCs/>
           <w:highlight w:val="yellow"/>
-          <w:lang w:val="en-US"/>
         </w:rPr>
         <w:t xml:space="preserve"> INT PRIMARY KEY AUTO_INCREMENT,</w:t>
       </w:r>
@@ -3788,15 +3743,13 @@
           <w:rFonts w:eastAsia="Times New Roman"/>
           <w:bCs/>
           <w:highlight w:val="yellow"/>
-          <w:lang w:val="en-US"/>
-        </w:rPr>
-      </w:pPr>
-      <w:r>
-        <w:rPr>
-          <w:rFonts w:eastAsia="Times New Roman"/>
-          <w:bCs/>
-          <w:highlight w:val="yellow"/>
-          <w:lang w:val="en-US"/>
+        </w:rPr>
+      </w:pPr>
+      <w:r>
+        <w:rPr>
+          <w:rFonts w:eastAsia="Times New Roman"/>
+          <w:bCs/>
+          <w:highlight w:val="yellow"/>
         </w:rPr>
         <w:t xml:space="preserve">    </w:t>
       </w:r>
@@ -3806,7 +3759,6 @@
           <w:rFonts w:eastAsia="Times New Roman"/>
           <w:bCs/>
           <w:highlight w:val="yellow"/>
-          <w:lang w:val="en-US"/>
         </w:rPr>
         <w:t>Description_Contenu</w:t>
       </w:r>
@@ -3816,7 +3768,6 @@
           <w:rFonts w:eastAsia="Times New Roman"/>
           <w:bCs/>
           <w:highlight w:val="yellow"/>
-          <w:lang w:val="en-US"/>
         </w:rPr>
         <w:t xml:space="preserve"> TEXT,</w:t>
       </w:r>
@@ -3828,15 +3779,13 @@
           <w:rFonts w:eastAsia="Times New Roman"/>
           <w:bCs/>
           <w:highlight w:val="yellow"/>
-          <w:lang w:val="en-US"/>
-        </w:rPr>
-      </w:pPr>
-      <w:r>
-        <w:rPr>
-          <w:rFonts w:eastAsia="Times New Roman"/>
-          <w:bCs/>
-          <w:highlight w:val="yellow"/>
-          <w:lang w:val="en-US"/>
+        </w:rPr>
+      </w:pPr>
+      <w:r>
+        <w:rPr>
+          <w:rFonts w:eastAsia="Times New Roman"/>
+          <w:bCs/>
+          <w:highlight w:val="yellow"/>
         </w:rPr>
         <w:t xml:space="preserve">    </w:t>
       </w:r>
@@ -3846,7 +3795,6 @@
           <w:rFonts w:eastAsia="Times New Roman"/>
           <w:bCs/>
           <w:highlight w:val="yellow"/>
-          <w:lang w:val="en-US"/>
         </w:rPr>
         <w:t>Adresse_image_Contenu</w:t>
       </w:r>
@@ -3856,46 +3804,24 @@
           <w:rFonts w:eastAsia="Times New Roman"/>
           <w:bCs/>
           <w:highlight w:val="yellow"/>
-          <w:lang w:val="en-US"/>
-        </w:rPr>
-        <w:t xml:space="preserve"> </w:t>
-      </w:r>
-      <w:proofErr w:type="gramStart"/>
-      <w:r>
-        <w:rPr>
-          <w:rFonts w:eastAsia="Times New Roman"/>
-          <w:bCs/>
-          <w:highlight w:val="yellow"/>
-          <w:lang w:val="en-US"/>
-        </w:rPr>
-        <w:t>VARCHAR(</w:t>
-      </w:r>
-      <w:proofErr w:type="gramEnd"/>
-      <w:r>
-        <w:rPr>
-          <w:rFonts w:eastAsia="Times New Roman"/>
-          <w:bCs/>
-          <w:highlight w:val="yellow"/>
-          <w:lang w:val="en-US"/>
-        </w:rPr>
-        <w:t>255),</w:t>
-      </w:r>
-    </w:p>
-    <w:p>
-      <w:pPr>
-        <w:spacing w:after="0"/>
-        <w:rPr>
-          <w:rFonts w:eastAsia="Times New Roman"/>
-          <w:bCs/>
-          <w:highlight w:val="yellow"/>
-        </w:rPr>
-      </w:pPr>
-      <w:r>
-        <w:rPr>
-          <w:rFonts w:eastAsia="Times New Roman"/>
-          <w:bCs/>
-          <w:highlight w:val="yellow"/>
-          <w:lang w:val="en-US"/>
+        </w:rPr>
+        <w:t xml:space="preserve"> VARCHAR(255),</w:t>
+      </w:r>
+    </w:p>
+    <w:p>
+      <w:pPr>
+        <w:spacing w:after="0"/>
+        <w:rPr>
+          <w:rFonts w:eastAsia="Times New Roman"/>
+          <w:bCs/>
+          <w:highlight w:val="yellow"/>
+        </w:rPr>
+      </w:pPr>
+      <w:r>
+        <w:rPr>
+          <w:rFonts w:eastAsia="Times New Roman"/>
+          <w:bCs/>
+          <w:highlight w:val="yellow"/>
         </w:rPr>
         <w:t xml:space="preserve">    </w:t>
       </w:r>
@@ -10430,12 +10356,14 @@
         <w:rPr>
           <w:rFonts w:eastAsia="Times New Roman"/>
           <w:bCs/>
-        </w:rPr>
-      </w:pPr>
-      <w:r>
-        <w:rPr>
-          <w:rFonts w:eastAsia="Times New Roman"/>
-          <w:bCs/>
+          <w:lang w:val="en-US"/>
+        </w:rPr>
+      </w:pPr>
+      <w:r>
+        <w:rPr>
+          <w:rFonts w:eastAsia="Times New Roman"/>
+          <w:bCs/>
+          <w:lang w:val="en-US"/>
         </w:rPr>
         <w:t>BEGIN</w:t>
       </w:r>
@@ -10446,12 +10374,14 @@
         <w:rPr>
           <w:rFonts w:eastAsia="Times New Roman"/>
           <w:bCs/>
-        </w:rPr>
-      </w:pPr>
-      <w:r>
-        <w:rPr>
-          <w:rFonts w:eastAsia="Times New Roman"/>
-          <w:bCs/>
+          <w:lang w:val="en-US"/>
+        </w:rPr>
+      </w:pPr>
+      <w:r>
+        <w:rPr>
+          <w:rFonts w:eastAsia="Times New Roman"/>
+          <w:bCs/>
+          <w:lang w:val="en-US"/>
         </w:rPr>
         <w:t xml:space="preserve">    DECLARE </w:t>
       </w:r>
@@ -10460,6 +10390,7 @@
         <w:rPr>
           <w:rFonts w:eastAsia="Times New Roman"/>
           <w:bCs/>
+          <w:lang w:val="en-US"/>
         </w:rPr>
         <w:t>msg_status</w:t>
       </w:r>
@@ -10468,31 +10399,52 @@
         <w:rPr>
           <w:rFonts w:eastAsia="Times New Roman"/>
           <w:bCs/>
-        </w:rPr>
-        <w:t xml:space="preserve"> VARCHAR(20);</w:t>
-      </w:r>
-    </w:p>
-    <w:p>
-      <w:pPr>
-        <w:spacing w:after="0"/>
-        <w:rPr>
-          <w:rFonts w:eastAsia="Times New Roman"/>
-          <w:bCs/>
-        </w:rPr>
-      </w:pPr>
-    </w:p>
-    <w:p>
-      <w:pPr>
-        <w:spacing w:after="0"/>
-        <w:rPr>
-          <w:rFonts w:eastAsia="Times New Roman"/>
-          <w:bCs/>
-        </w:rPr>
-      </w:pPr>
-      <w:r>
-        <w:rPr>
-          <w:rFonts w:eastAsia="Times New Roman"/>
-          <w:bCs/>
+          <w:lang w:val="en-US"/>
+        </w:rPr>
+        <w:t xml:space="preserve"> </w:t>
+      </w:r>
+      <w:proofErr w:type="gramStart"/>
+      <w:r>
+        <w:rPr>
+          <w:rFonts w:eastAsia="Times New Roman"/>
+          <w:bCs/>
+          <w:lang w:val="en-US"/>
+        </w:rPr>
+        <w:t>VARCHAR(</w:t>
+      </w:r>
+      <w:proofErr w:type="gramEnd"/>
+      <w:r>
+        <w:rPr>
+          <w:rFonts w:eastAsia="Times New Roman"/>
+          <w:bCs/>
+          <w:lang w:val="en-US"/>
+        </w:rPr>
+        <w:t>20);</w:t>
+      </w:r>
+    </w:p>
+    <w:p>
+      <w:pPr>
+        <w:spacing w:after="0"/>
+        <w:rPr>
+          <w:rFonts w:eastAsia="Times New Roman"/>
+          <w:bCs/>
+          <w:lang w:val="en-US"/>
+        </w:rPr>
+      </w:pPr>
+    </w:p>
+    <w:p>
+      <w:pPr>
+        <w:spacing w:after="0"/>
+        <w:rPr>
+          <w:rFonts w:eastAsia="Times New Roman"/>
+          <w:bCs/>
+        </w:rPr>
+      </w:pPr>
+      <w:r>
+        <w:rPr>
+          <w:rFonts w:eastAsia="Times New Roman"/>
+          <w:bCs/>
+          <w:lang w:val="en-US"/>
         </w:rPr>
         <w:t xml:space="preserve">    </w:t>
       </w:r>
@@ -20107,14 +20059,12 @@
         <w:rPr>
           <w:rFonts w:eastAsia="Times New Roman"/>
           <w:bCs/>
-          <w:lang w:val="en-US"/>
-        </w:rPr>
-      </w:pPr>
-      <w:r>
-        <w:rPr>
-          <w:rFonts w:eastAsia="Times New Roman"/>
-          <w:bCs/>
-          <w:lang w:val="en-US"/>
+        </w:rPr>
+      </w:pPr>
+      <w:r>
+        <w:rPr>
+          <w:rFonts w:eastAsia="Times New Roman"/>
+          <w:bCs/>
         </w:rPr>
         <w:t>(21, 1),</w:t>
       </w:r>
@@ -20125,14 +20075,12 @@
         <w:rPr>
           <w:rFonts w:eastAsia="Times New Roman"/>
           <w:bCs/>
-          <w:lang w:val="en-US"/>
-        </w:rPr>
-      </w:pPr>
-      <w:r>
-        <w:rPr>
-          <w:rFonts w:eastAsia="Times New Roman"/>
-          <w:bCs/>
-          <w:lang w:val="en-US"/>
+        </w:rPr>
+      </w:pPr>
+      <w:r>
+        <w:rPr>
+          <w:rFonts w:eastAsia="Times New Roman"/>
+          <w:bCs/>
         </w:rPr>
         <w:t>(21, 2),</w:t>
       </w:r>
@@ -20143,14 +20091,12 @@
         <w:rPr>
           <w:rFonts w:eastAsia="Times New Roman"/>
           <w:bCs/>
-          <w:lang w:val="en-US"/>
-        </w:rPr>
-      </w:pPr>
-      <w:r>
-        <w:rPr>
-          <w:rFonts w:eastAsia="Times New Roman"/>
-          <w:bCs/>
-          <w:lang w:val="en-US"/>
+        </w:rPr>
+      </w:pPr>
+      <w:r>
+        <w:rPr>
+          <w:rFonts w:eastAsia="Times New Roman"/>
+          <w:bCs/>
         </w:rPr>
         <w:t>(21, 3),</w:t>
       </w:r>
@@ -20161,14 +20107,12 @@
         <w:rPr>
           <w:rFonts w:eastAsia="Times New Roman"/>
           <w:bCs/>
-          <w:lang w:val="en-US"/>
-        </w:rPr>
-      </w:pPr>
-      <w:r>
-        <w:rPr>
-          <w:rFonts w:eastAsia="Times New Roman"/>
-          <w:bCs/>
-          <w:lang w:val="en-US"/>
+        </w:rPr>
+      </w:pPr>
+      <w:r>
+        <w:rPr>
+          <w:rFonts w:eastAsia="Times New Roman"/>
+          <w:bCs/>
         </w:rPr>
         <w:t>(21, 4),</w:t>
       </w:r>
@@ -20179,14 +20123,12 @@
         <w:rPr>
           <w:rFonts w:eastAsia="Times New Roman"/>
           <w:bCs/>
-          <w:lang w:val="en-US"/>
-        </w:rPr>
-      </w:pPr>
-      <w:r>
-        <w:rPr>
-          <w:rFonts w:eastAsia="Times New Roman"/>
-          <w:bCs/>
-          <w:lang w:val="en-US"/>
+        </w:rPr>
+      </w:pPr>
+      <w:r>
+        <w:rPr>
+          <w:rFonts w:eastAsia="Times New Roman"/>
+          <w:bCs/>
         </w:rPr>
         <w:t>(21, 5),</w:t>
       </w:r>
@@ -20197,14 +20139,12 @@
         <w:rPr>
           <w:rFonts w:eastAsia="Times New Roman"/>
           <w:bCs/>
-          <w:lang w:val="en-US"/>
-        </w:rPr>
-      </w:pPr>
-      <w:r>
-        <w:rPr>
-          <w:rFonts w:eastAsia="Times New Roman"/>
-          <w:bCs/>
-          <w:lang w:val="en-US"/>
+        </w:rPr>
+      </w:pPr>
+      <w:r>
+        <w:rPr>
+          <w:rFonts w:eastAsia="Times New Roman"/>
+          <w:bCs/>
         </w:rPr>
         <w:t>(21, 6),</w:t>
       </w:r>
@@ -20215,24 +20155,21 @@
         <w:rPr>
           <w:rFonts w:eastAsia="Times New Roman"/>
           <w:bCs/>
-          <w:lang w:val="en-US"/>
-        </w:rPr>
-      </w:pPr>
-    </w:p>
-    <w:p>
-      <w:pPr>
-        <w:spacing w:after="0"/>
-        <w:rPr>
-          <w:rFonts w:eastAsia="Times New Roman"/>
-          <w:bCs/>
-          <w:lang w:val="en-US"/>
-        </w:rPr>
-      </w:pPr>
-      <w:r>
-        <w:rPr>
-          <w:rFonts w:eastAsia="Times New Roman"/>
-          <w:bCs/>
-          <w:lang w:val="en-US"/>
+        </w:rPr>
+      </w:pPr>
+    </w:p>
+    <w:p>
+      <w:pPr>
+        <w:spacing w:after="0"/>
+        <w:rPr>
+          <w:rFonts w:eastAsia="Times New Roman"/>
+          <w:bCs/>
+        </w:rPr>
+      </w:pPr>
+      <w:r>
+        <w:rPr>
+          <w:rFonts w:eastAsia="Times New Roman"/>
+          <w:bCs/>
         </w:rPr>
         <w:t>(22, 7),</w:t>
       </w:r>
@@ -20243,14 +20180,12 @@
         <w:rPr>
           <w:rFonts w:eastAsia="Times New Roman"/>
           <w:bCs/>
-          <w:lang w:val="en-US"/>
-        </w:rPr>
-      </w:pPr>
-      <w:r>
-        <w:rPr>
-          <w:rFonts w:eastAsia="Times New Roman"/>
-          <w:bCs/>
-          <w:lang w:val="en-US"/>
+        </w:rPr>
+      </w:pPr>
+      <w:r>
+        <w:rPr>
+          <w:rFonts w:eastAsia="Times New Roman"/>
+          <w:bCs/>
         </w:rPr>
         <w:t>(22, 8),</w:t>
       </w:r>
@@ -20261,14 +20196,12 @@
         <w:rPr>
           <w:rFonts w:eastAsia="Times New Roman"/>
           <w:bCs/>
-          <w:lang w:val="en-US"/>
-        </w:rPr>
-      </w:pPr>
-      <w:r>
-        <w:rPr>
-          <w:rFonts w:eastAsia="Times New Roman"/>
-          <w:bCs/>
-          <w:lang w:val="en-US"/>
+        </w:rPr>
+      </w:pPr>
+      <w:r>
+        <w:rPr>
+          <w:rFonts w:eastAsia="Times New Roman"/>
+          <w:bCs/>
         </w:rPr>
         <w:t>(22, 9),</w:t>
       </w:r>
@@ -20279,14 +20212,12 @@
         <w:rPr>
           <w:rFonts w:eastAsia="Times New Roman"/>
           <w:bCs/>
-          <w:lang w:val="en-US"/>
-        </w:rPr>
-      </w:pPr>
-      <w:r>
-        <w:rPr>
-          <w:rFonts w:eastAsia="Times New Roman"/>
-          <w:bCs/>
-          <w:lang w:val="en-US"/>
+        </w:rPr>
+      </w:pPr>
+      <w:r>
+        <w:rPr>
+          <w:rFonts w:eastAsia="Times New Roman"/>
+          <w:bCs/>
         </w:rPr>
         <w:t>(22, 10),</w:t>
       </w:r>
@@ -20297,14 +20228,12 @@
         <w:rPr>
           <w:rFonts w:eastAsia="Times New Roman"/>
           <w:bCs/>
-          <w:lang w:val="en-US"/>
-        </w:rPr>
-      </w:pPr>
-      <w:r>
-        <w:rPr>
-          <w:rFonts w:eastAsia="Times New Roman"/>
-          <w:bCs/>
-          <w:lang w:val="en-US"/>
+        </w:rPr>
+      </w:pPr>
+      <w:r>
+        <w:rPr>
+          <w:rFonts w:eastAsia="Times New Roman"/>
+          <w:bCs/>
         </w:rPr>
         <w:t>(22, 11),</w:t>
       </w:r>
@@ -20315,24 +20244,21 @@
         <w:rPr>
           <w:rFonts w:eastAsia="Times New Roman"/>
           <w:bCs/>
-          <w:lang w:val="en-US"/>
-        </w:rPr>
-      </w:pPr>
-    </w:p>
-    <w:p>
-      <w:pPr>
-        <w:spacing w:after="0"/>
-        <w:rPr>
-          <w:rFonts w:eastAsia="Times New Roman"/>
-          <w:bCs/>
-          <w:lang w:val="en-US"/>
-        </w:rPr>
-      </w:pPr>
-      <w:r>
-        <w:rPr>
-          <w:rFonts w:eastAsia="Times New Roman"/>
-          <w:bCs/>
-          <w:lang w:val="en-US"/>
+        </w:rPr>
+      </w:pPr>
+    </w:p>
+    <w:p>
+      <w:pPr>
+        <w:spacing w:after="0"/>
+        <w:rPr>
+          <w:rFonts w:eastAsia="Times New Roman"/>
+          <w:bCs/>
+        </w:rPr>
+      </w:pPr>
+      <w:r>
+        <w:rPr>
+          <w:rFonts w:eastAsia="Times New Roman"/>
+          <w:bCs/>
         </w:rPr>
         <w:lastRenderedPageBreak/>
         <w:t>(23, 12),</w:t>
@@ -20344,14 +20270,12 @@
         <w:rPr>
           <w:rFonts w:eastAsia="Times New Roman"/>
           <w:bCs/>
-          <w:lang w:val="en-US"/>
-        </w:rPr>
-      </w:pPr>
-      <w:r>
-        <w:rPr>
-          <w:rFonts w:eastAsia="Times New Roman"/>
-          <w:bCs/>
-          <w:lang w:val="en-US"/>
+        </w:rPr>
+      </w:pPr>
+      <w:r>
+        <w:rPr>
+          <w:rFonts w:eastAsia="Times New Roman"/>
+          <w:bCs/>
         </w:rPr>
         <w:t>(23, 13),</w:t>
       </w:r>
@@ -20362,14 +20286,12 @@
         <w:rPr>
           <w:rFonts w:eastAsia="Times New Roman"/>
           <w:bCs/>
-          <w:lang w:val="en-US"/>
-        </w:rPr>
-      </w:pPr>
-      <w:r>
-        <w:rPr>
-          <w:rFonts w:eastAsia="Times New Roman"/>
-          <w:bCs/>
-          <w:lang w:val="en-US"/>
+        </w:rPr>
+      </w:pPr>
+      <w:r>
+        <w:rPr>
+          <w:rFonts w:eastAsia="Times New Roman"/>
+          <w:bCs/>
         </w:rPr>
         <w:t>(23, 14),</w:t>
       </w:r>
@@ -20380,14 +20302,12 @@
         <w:rPr>
           <w:rFonts w:eastAsia="Times New Roman"/>
           <w:bCs/>
-          <w:lang w:val="en-US"/>
-        </w:rPr>
-      </w:pPr>
-      <w:r>
-        <w:rPr>
-          <w:rFonts w:eastAsia="Times New Roman"/>
-          <w:bCs/>
-          <w:lang w:val="en-US"/>
+        </w:rPr>
+      </w:pPr>
+      <w:r>
+        <w:rPr>
+          <w:rFonts w:eastAsia="Times New Roman"/>
+          <w:bCs/>
         </w:rPr>
         <w:t>(23, 15),</w:t>
       </w:r>
@@ -20398,24 +20318,21 @@
         <w:rPr>
           <w:rFonts w:eastAsia="Times New Roman"/>
           <w:bCs/>
-          <w:lang w:val="en-US"/>
-        </w:rPr>
-      </w:pPr>
-    </w:p>
-    <w:p>
-      <w:pPr>
-        <w:spacing w:after="0"/>
-        <w:rPr>
-          <w:rFonts w:eastAsia="Times New Roman"/>
-          <w:bCs/>
-          <w:lang w:val="en-US"/>
-        </w:rPr>
-      </w:pPr>
-      <w:r>
-        <w:rPr>
-          <w:rFonts w:eastAsia="Times New Roman"/>
-          <w:bCs/>
-          <w:lang w:val="en-US"/>
+        </w:rPr>
+      </w:pPr>
+    </w:p>
+    <w:p>
+      <w:pPr>
+        <w:spacing w:after="0"/>
+        <w:rPr>
+          <w:rFonts w:eastAsia="Times New Roman"/>
+          <w:bCs/>
+        </w:rPr>
+      </w:pPr>
+      <w:r>
+        <w:rPr>
+          <w:rFonts w:eastAsia="Times New Roman"/>
+          <w:bCs/>
         </w:rPr>
         <w:t>(24, 16),</w:t>
       </w:r>
@@ -20426,14 +20343,12 @@
         <w:rPr>
           <w:rFonts w:eastAsia="Times New Roman"/>
           <w:bCs/>
-          <w:lang w:val="en-US"/>
-        </w:rPr>
-      </w:pPr>
-      <w:r>
-        <w:rPr>
-          <w:rFonts w:eastAsia="Times New Roman"/>
-          <w:bCs/>
-          <w:lang w:val="en-US"/>
+        </w:rPr>
+      </w:pPr>
+      <w:r>
+        <w:rPr>
+          <w:rFonts w:eastAsia="Times New Roman"/>
+          <w:bCs/>
         </w:rPr>
         <w:t>(24, 17),</w:t>
       </w:r>
@@ -20444,14 +20359,12 @@
         <w:rPr>
           <w:rFonts w:eastAsia="Times New Roman"/>
           <w:bCs/>
-          <w:lang w:val="en-US"/>
-        </w:rPr>
-      </w:pPr>
-      <w:r>
-        <w:rPr>
-          <w:rFonts w:eastAsia="Times New Roman"/>
-          <w:bCs/>
-          <w:lang w:val="en-US"/>
+        </w:rPr>
+      </w:pPr>
+      <w:r>
+        <w:rPr>
+          <w:rFonts w:eastAsia="Times New Roman"/>
+          <w:bCs/>
         </w:rPr>
         <w:t>(24, 18),</w:t>
       </w:r>
@@ -20462,14 +20375,12 @@
         <w:rPr>
           <w:rFonts w:eastAsia="Times New Roman"/>
           <w:bCs/>
-          <w:lang w:val="en-US"/>
-        </w:rPr>
-      </w:pPr>
-      <w:r>
-        <w:rPr>
-          <w:rFonts w:eastAsia="Times New Roman"/>
-          <w:bCs/>
-          <w:lang w:val="en-US"/>
+        </w:rPr>
+      </w:pPr>
+      <w:r>
+        <w:rPr>
+          <w:rFonts w:eastAsia="Times New Roman"/>
+          <w:bCs/>
         </w:rPr>
         <w:t>(24, 19),</w:t>
       </w:r>
@@ -20480,14 +20391,12 @@
         <w:rPr>
           <w:rFonts w:eastAsia="Times New Roman"/>
           <w:bCs/>
-          <w:lang w:val="en-US"/>
-        </w:rPr>
-      </w:pPr>
-      <w:r>
-        <w:rPr>
-          <w:rFonts w:eastAsia="Times New Roman"/>
-          <w:bCs/>
-          <w:lang w:val="en-US"/>
+        </w:rPr>
+      </w:pPr>
+      <w:r>
+        <w:rPr>
+          <w:rFonts w:eastAsia="Times New Roman"/>
+          <w:bCs/>
         </w:rPr>
         <w:t>(24, 20),</w:t>
       </w:r>
@@ -20498,14 +20407,12 @@
         <w:rPr>
           <w:rFonts w:eastAsia="Times New Roman"/>
           <w:bCs/>
-          <w:lang w:val="en-US"/>
-        </w:rPr>
-      </w:pPr>
-      <w:r>
-        <w:rPr>
-          <w:rFonts w:eastAsia="Times New Roman"/>
-          <w:bCs/>
-          <w:lang w:val="en-US"/>
+        </w:rPr>
+      </w:pPr>
+      <w:r>
+        <w:rPr>
+          <w:rFonts w:eastAsia="Times New Roman"/>
+          <w:bCs/>
         </w:rPr>
         <w:t>(24, 21),</w:t>
       </w:r>
@@ -20516,24 +20423,21 @@
         <w:rPr>
           <w:rFonts w:eastAsia="Times New Roman"/>
           <w:bCs/>
-          <w:lang w:val="en-US"/>
-        </w:rPr>
-      </w:pPr>
-    </w:p>
-    <w:p>
-      <w:pPr>
-        <w:spacing w:after="0"/>
-        <w:rPr>
-          <w:rFonts w:eastAsia="Times New Roman"/>
-          <w:bCs/>
-          <w:lang w:val="en-US"/>
-        </w:rPr>
-      </w:pPr>
-      <w:r>
-        <w:rPr>
-          <w:rFonts w:eastAsia="Times New Roman"/>
-          <w:bCs/>
-          <w:lang w:val="en-US"/>
+        </w:rPr>
+      </w:pPr>
+    </w:p>
+    <w:p>
+      <w:pPr>
+        <w:spacing w:after="0"/>
+        <w:rPr>
+          <w:rFonts w:eastAsia="Times New Roman"/>
+          <w:bCs/>
+        </w:rPr>
+      </w:pPr>
+      <w:r>
+        <w:rPr>
+          <w:rFonts w:eastAsia="Times New Roman"/>
+          <w:bCs/>
         </w:rPr>
         <w:t>(25, 22),</w:t>
       </w:r>
@@ -20544,14 +20448,12 @@
         <w:rPr>
           <w:rFonts w:eastAsia="Times New Roman"/>
           <w:bCs/>
-          <w:lang w:val="en-US"/>
-        </w:rPr>
-      </w:pPr>
-      <w:r>
-        <w:rPr>
-          <w:rFonts w:eastAsia="Times New Roman"/>
-          <w:bCs/>
-          <w:lang w:val="en-US"/>
+        </w:rPr>
+      </w:pPr>
+      <w:r>
+        <w:rPr>
+          <w:rFonts w:eastAsia="Times New Roman"/>
+          <w:bCs/>
         </w:rPr>
         <w:t>(25, 23),</w:t>
       </w:r>
@@ -20562,14 +20464,12 @@
         <w:rPr>
           <w:rFonts w:eastAsia="Times New Roman"/>
           <w:bCs/>
-          <w:lang w:val="en-US"/>
-        </w:rPr>
-      </w:pPr>
-      <w:r>
-        <w:rPr>
-          <w:rFonts w:eastAsia="Times New Roman"/>
-          <w:bCs/>
-          <w:lang w:val="en-US"/>
+        </w:rPr>
+      </w:pPr>
+      <w:r>
+        <w:rPr>
+          <w:rFonts w:eastAsia="Times New Roman"/>
+          <w:bCs/>
         </w:rPr>
         <w:t>(25, 24),</w:t>
       </w:r>
@@ -20580,14 +20480,12 @@
         <w:rPr>
           <w:rFonts w:eastAsia="Times New Roman"/>
           <w:bCs/>
-          <w:lang w:val="en-US"/>
-        </w:rPr>
-      </w:pPr>
-      <w:r>
-        <w:rPr>
-          <w:rFonts w:eastAsia="Times New Roman"/>
-          <w:bCs/>
-          <w:lang w:val="en-US"/>
+        </w:rPr>
+      </w:pPr>
+      <w:r>
+        <w:rPr>
+          <w:rFonts w:eastAsia="Times New Roman"/>
+          <w:bCs/>
         </w:rPr>
         <w:t>(25, 25),</w:t>
       </w:r>
@@ -20598,14 +20496,12 @@
         <w:rPr>
           <w:rFonts w:eastAsia="Times New Roman"/>
           <w:bCs/>
-          <w:lang w:val="en-US"/>
-        </w:rPr>
-      </w:pPr>
-      <w:r>
-        <w:rPr>
-          <w:rFonts w:eastAsia="Times New Roman"/>
-          <w:bCs/>
-          <w:lang w:val="en-US"/>
+        </w:rPr>
+      </w:pPr>
+      <w:r>
+        <w:rPr>
+          <w:rFonts w:eastAsia="Times New Roman"/>
+          <w:bCs/>
         </w:rPr>
         <w:t>(25, 26),</w:t>
       </w:r>
@@ -20616,14 +20512,12 @@
         <w:rPr>
           <w:rFonts w:eastAsia="Times New Roman"/>
           <w:bCs/>
-          <w:lang w:val="en-US"/>
-        </w:rPr>
-      </w:pPr>
-      <w:r>
-        <w:rPr>
-          <w:rFonts w:eastAsia="Times New Roman"/>
-          <w:bCs/>
-          <w:lang w:val="en-US"/>
+        </w:rPr>
+      </w:pPr>
+      <w:r>
+        <w:rPr>
+          <w:rFonts w:eastAsia="Times New Roman"/>
+          <w:bCs/>
         </w:rPr>
         <w:t>(25, 27),</w:t>
       </w:r>
@@ -20634,14 +20528,12 @@
         <w:rPr>
           <w:rFonts w:eastAsia="Times New Roman"/>
           <w:bCs/>
-          <w:lang w:val="en-US"/>
-        </w:rPr>
-      </w:pPr>
-      <w:r>
-        <w:rPr>
-          <w:rFonts w:eastAsia="Times New Roman"/>
-          <w:bCs/>
-          <w:lang w:val="en-US"/>
+        </w:rPr>
+      </w:pPr>
+      <w:r>
+        <w:rPr>
+          <w:rFonts w:eastAsia="Times New Roman"/>
+          <w:bCs/>
         </w:rPr>
         <w:t>(25, 28),</w:t>
       </w:r>
@@ -20652,24 +20544,21 @@
         <w:rPr>
           <w:rFonts w:eastAsia="Times New Roman"/>
           <w:bCs/>
-          <w:lang w:val="en-US"/>
-        </w:rPr>
-      </w:pPr>
-    </w:p>
-    <w:p>
-      <w:pPr>
-        <w:spacing w:after="0"/>
-        <w:rPr>
-          <w:rFonts w:eastAsia="Times New Roman"/>
-          <w:bCs/>
-          <w:lang w:val="en-US"/>
-        </w:rPr>
-      </w:pPr>
-      <w:r>
-        <w:rPr>
-          <w:rFonts w:eastAsia="Times New Roman"/>
-          <w:bCs/>
-          <w:lang w:val="en-US"/>
+        </w:rPr>
+      </w:pPr>
+    </w:p>
+    <w:p>
+      <w:pPr>
+        <w:spacing w:after="0"/>
+        <w:rPr>
+          <w:rFonts w:eastAsia="Times New Roman"/>
+          <w:bCs/>
+        </w:rPr>
+      </w:pPr>
+      <w:r>
+        <w:rPr>
+          <w:rFonts w:eastAsia="Times New Roman"/>
+          <w:bCs/>
         </w:rPr>
         <w:t>(26, 29),</w:t>
       </w:r>
@@ -20680,14 +20569,12 @@
         <w:rPr>
           <w:rFonts w:eastAsia="Times New Roman"/>
           <w:bCs/>
-          <w:lang w:val="en-US"/>
-        </w:rPr>
-      </w:pPr>
-      <w:r>
-        <w:rPr>
-          <w:rFonts w:eastAsia="Times New Roman"/>
-          <w:bCs/>
-          <w:lang w:val="en-US"/>
+        </w:rPr>
+      </w:pPr>
+      <w:r>
+        <w:rPr>
+          <w:rFonts w:eastAsia="Times New Roman"/>
+          <w:bCs/>
         </w:rPr>
         <w:t>(26, 30),</w:t>
       </w:r>
@@ -20698,14 +20585,12 @@
         <w:rPr>
           <w:rFonts w:eastAsia="Times New Roman"/>
           <w:bCs/>
-          <w:lang w:val="en-US"/>
-        </w:rPr>
-      </w:pPr>
-      <w:r>
-        <w:rPr>
-          <w:rFonts w:eastAsia="Times New Roman"/>
-          <w:bCs/>
-          <w:lang w:val="en-US"/>
+        </w:rPr>
+      </w:pPr>
+      <w:r>
+        <w:rPr>
+          <w:rFonts w:eastAsia="Times New Roman"/>
+          <w:bCs/>
         </w:rPr>
         <w:t>(26, 31),</w:t>
       </w:r>
@@ -20716,14 +20601,12 @@
         <w:rPr>
           <w:rFonts w:eastAsia="Times New Roman"/>
           <w:bCs/>
-          <w:lang w:val="en-US"/>
-        </w:rPr>
-      </w:pPr>
-      <w:r>
-        <w:rPr>
-          <w:rFonts w:eastAsia="Times New Roman"/>
-          <w:bCs/>
-          <w:lang w:val="en-US"/>
+        </w:rPr>
+      </w:pPr>
+      <w:r>
+        <w:rPr>
+          <w:rFonts w:eastAsia="Times New Roman"/>
+          <w:bCs/>
         </w:rPr>
         <w:t>(26, 32);</w:t>
       </w:r>
@@ -28091,83 +27974,356 @@
           <w:rFonts w:eastAsia="Times New Roman"/>
           <w:bCs/>
         </w:rPr>
-        <w:t xml:space="preserve">Gestion </w:t>
-      </w:r>
+        <w:t>Gestion de l’interface administrateur</w:t>
+      </w:r>
+    </w:p>
+    <w:p>
+      <w:pPr>
+        <w:spacing w:after="0"/>
+      </w:pPr>
       <w:proofErr w:type="gramStart"/>
       <w:r>
-        <w:rPr>
-          <w:rFonts w:eastAsia="Times New Roman"/>
-          <w:bCs/>
-        </w:rPr>
-        <w:t>user</w:t>
+        <w:t>composer</w:t>
       </w:r>
       <w:proofErr w:type="gramEnd"/>
-    </w:p>
-    <w:p>
-      <w:pPr>
-        <w:spacing w:after="0"/>
-        <w:rPr>
-          <w:rFonts w:eastAsia="Times New Roman"/>
-          <w:bCs/>
-        </w:rPr>
-      </w:pPr>
-      <w:proofErr w:type="spellStart"/>
-      <w:r>
-        <w:rPr>
-          <w:rFonts w:eastAsia="Times New Roman"/>
-          <w:bCs/>
-        </w:rPr>
-        <w:t>Php</w:t>
-      </w:r>
-      <w:proofErr w:type="spellEnd"/>
-      <w:r>
-        <w:rPr>
-          <w:rFonts w:eastAsia="Times New Roman"/>
-          <w:bCs/>
-        </w:rPr>
+      <w:r>
+        <w:t xml:space="preserve"> </w:t>
+      </w:r>
+      <w:proofErr w:type="spellStart"/>
+      <w:r>
+        <w:t>require</w:t>
+      </w:r>
+      <w:proofErr w:type="spellEnd"/>
+      <w:r>
+        <w:t xml:space="preserve"> </w:t>
+      </w:r>
+      <w:proofErr w:type="spellStart"/>
+      <w:r>
+        <w:t>easycorp</w:t>
+      </w:r>
+      <w:proofErr w:type="spellEnd"/>
+      <w:r>
         <w:t>/</w:t>
       </w:r>
       <w:proofErr w:type="spellStart"/>
       <w:r>
-        <w:rPr>
-          <w:rFonts w:eastAsia="Times New Roman"/>
-          <w:bCs/>
-        </w:rPr>
-        <w:t>bin</w:t>
-      </w:r>
-      <w:proofErr w:type="spellEnd"/>
-      <w:r>
-        <w:rPr>
-          <w:rFonts w:eastAsia="Times New Roman"/>
-          <w:bCs/>
+        <w:t>easyadmin</w:t>
+      </w:r>
+      <w:proofErr w:type="spellEnd"/>
+      <w:r>
+        <w:t>-bundle</w:t>
+      </w:r>
+    </w:p>
+    <w:p>
+      <w:pPr>
+        <w:spacing w:after="0"/>
+      </w:pPr>
+      <w:proofErr w:type="spellStart"/>
+      <w:proofErr w:type="gramStart"/>
+      <w:r>
+        <w:t>symfony</w:t>
+      </w:r>
+      <w:proofErr w:type="spellEnd"/>
+      <w:proofErr w:type="gramEnd"/>
+      <w:r>
+        <w:t xml:space="preserve"> console</w:t>
+      </w:r>
+      <w:r>
+        <w:t xml:space="preserve"> </w:t>
+      </w:r>
+      <w:proofErr w:type="spellStart"/>
+      <w:r>
+        <w:t>make:admin:dashboard</w:t>
+      </w:r>
+      <w:proofErr w:type="spellEnd"/>
+    </w:p>
+    <w:p>
+      <w:pPr>
+        <w:spacing w:after="0"/>
+      </w:pPr>
+      <w:proofErr w:type="gramStart"/>
+      <w:r>
+        <w:t>ici</w:t>
+      </w:r>
+      <w:proofErr w:type="gramEnd"/>
+      <w:r>
+        <w:t xml:space="preserve"> création d’un </w:t>
+      </w:r>
+      <w:proofErr w:type="spellStart"/>
+      <w:r>
+        <w:t>dashbord</w:t>
+      </w:r>
+      <w:proofErr w:type="spellEnd"/>
+      <w:r>
+        <w:t xml:space="preserve"> pour gestion du site </w:t>
+      </w:r>
+      <w:r>
+        <w:t>http://127.0.0.1:8000/admin/Site</w:t>
+      </w:r>
+    </w:p>
+    <w:p>
+      <w:pPr>
+        <w:spacing w:after="0"/>
+      </w:pPr>
+      <w:r>
+        <w:t>Générer les CRUD</w:t>
+      </w:r>
+    </w:p>
+    <w:p>
+      <w:pPr>
+        <w:spacing w:after="0"/>
+        <w:rPr>
+          <w:lang w:val="en-US"/>
+        </w:rPr>
+      </w:pPr>
+      <w:proofErr w:type="spellStart"/>
+      <w:proofErr w:type="gramStart"/>
+      <w:r>
+        <w:rPr>
+          <w:lang w:val="en-US"/>
+        </w:rPr>
+        <w:t>symfony</w:t>
+      </w:r>
+      <w:proofErr w:type="spellEnd"/>
+      <w:proofErr w:type="gramEnd"/>
+      <w:r>
+        <w:rPr>
+          <w:lang w:val="en-US"/>
         </w:rPr>
         <w:t xml:space="preserve"> console </w:t>
       </w:r>
       <w:proofErr w:type="spellStart"/>
       <w:r>
         <w:rPr>
-          <w:rFonts w:eastAsia="Times New Roman"/>
-          <w:bCs/>
-        </w:rPr>
-        <w:t>make</w:t>
-      </w:r>
-      <w:proofErr w:type="spellEnd"/>
-      <w:r>
-        <w:rPr>
-          <w:rFonts w:eastAsia="Times New Roman"/>
-          <w:bCs/>
-        </w:rPr>
-        <w:t xml:space="preserve"> </w:t>
-      </w:r>
+          <w:lang w:val="en-US"/>
+        </w:rPr>
+        <w:t>make:admin:crud</w:t>
+      </w:r>
+      <w:proofErr w:type="spellEnd"/>
+    </w:p>
+    <w:p>
+      <w:pPr>
+        <w:spacing w:after="0"/>
+        <w:rPr>
+          <w:rFonts w:eastAsia="Times New Roman"/>
+          <w:bCs/>
+          <w:lang w:val="en-US"/>
+        </w:rPr>
+      </w:pPr>
+    </w:p>
+    <w:p>
+      <w:pPr>
+        <w:spacing w:after="0"/>
+        <w:rPr>
+          <w:rFonts w:eastAsia="Times New Roman"/>
+          <w:bCs/>
+          <w:lang w:val="en-US"/>
+        </w:rPr>
+      </w:pPr>
+      <w:proofErr w:type="spellStart"/>
+      <w:r>
+        <w:rPr>
+          <w:rFonts w:eastAsia="Times New Roman"/>
+          <w:bCs/>
+          <w:lang w:val="en-US"/>
+        </w:rPr>
+        <w:t>Gestion</w:t>
+      </w:r>
+      <w:proofErr w:type="spellEnd"/>
+      <w:r>
+        <w:rPr>
+          <w:rFonts w:eastAsia="Times New Roman"/>
+          <w:bCs/>
+          <w:lang w:val="en-US"/>
+        </w:rPr>
+        <w:t xml:space="preserve"> user</w:t>
+      </w:r>
+    </w:p>
+    <w:p>
+      <w:pPr>
+        <w:spacing w:after="0"/>
+        <w:rPr>
+          <w:lang w:val="en-US"/>
+        </w:rPr>
+      </w:pPr>
+      <w:proofErr w:type="spellStart"/>
       <w:proofErr w:type="gramStart"/>
       <w:r>
         <w:rPr>
-          <w:rFonts w:eastAsia="Times New Roman"/>
-          <w:bCs/>
-        </w:rPr>
-        <w:t>user</w:t>
-      </w:r>
+          <w:lang w:val="en-US"/>
+        </w:rPr>
+        <w:t>symfony</w:t>
+      </w:r>
+      <w:proofErr w:type="spellEnd"/>
       <w:proofErr w:type="gramEnd"/>
+      <w:r>
+        <w:rPr>
+          <w:lang w:val="en-US"/>
+        </w:rPr>
+        <w:t xml:space="preserve"> console </w:t>
+      </w:r>
+      <w:proofErr w:type="spellStart"/>
+      <w:r>
+        <w:rPr>
+          <w:lang w:val="en-US"/>
+        </w:rPr>
+        <w:t>make:user</w:t>
+      </w:r>
+      <w:proofErr w:type="spellEnd"/>
+    </w:p>
+    <w:p>
+      <w:pPr>
+        <w:spacing w:after="0"/>
+        <w:rPr>
+          <w:bCs/>
+        </w:rPr>
+      </w:pPr>
+      <w:proofErr w:type="spellStart"/>
+      <w:proofErr w:type="gramStart"/>
+      <w:r>
+        <w:rPr>
+          <w:bCs/>
+        </w:rPr>
+        <w:t>symfony</w:t>
+      </w:r>
+      <w:proofErr w:type="spellEnd"/>
+      <w:proofErr w:type="gramEnd"/>
+      <w:r>
+        <w:rPr>
+          <w:bCs/>
+        </w:rPr>
+        <w:t xml:space="preserve"> console </w:t>
+      </w:r>
+      <w:proofErr w:type="spellStart"/>
+      <w:r>
+        <w:rPr>
+          <w:bCs/>
+        </w:rPr>
+        <w:t>make:entity</w:t>
+      </w:r>
+      <w:proofErr w:type="spellEnd"/>
+      <w:r>
+        <w:rPr>
+          <w:bCs/>
+        </w:rPr>
+        <w:t xml:space="preserve"> pour ajouter nom, </w:t>
+      </w:r>
+      <w:proofErr w:type="spellStart"/>
+      <w:r>
+        <w:rPr>
+          <w:bCs/>
+        </w:rPr>
+        <w:t>prenom</w:t>
+      </w:r>
+      <w:proofErr w:type="spellEnd"/>
+      <w:r>
+        <w:rPr>
+          <w:bCs/>
+        </w:rPr>
+        <w:t>, adresse</w:t>
+      </w:r>
+    </w:p>
+    <w:p>
+      <w:pPr>
+        <w:spacing w:after="0"/>
+        <w:rPr>
+          <w:bCs/>
+          <w:lang w:val="en-US"/>
+        </w:rPr>
+      </w:pPr>
+      <w:proofErr w:type="spellStart"/>
+      <w:proofErr w:type="gramStart"/>
+      <w:r>
+        <w:rPr>
+          <w:bCs/>
+          <w:lang w:val="en-US"/>
+        </w:rPr>
+        <w:t>symfony</w:t>
+      </w:r>
+      <w:proofErr w:type="spellEnd"/>
+      <w:proofErr w:type="gramEnd"/>
+      <w:r>
+        <w:rPr>
+          <w:bCs/>
+          <w:lang w:val="en-US"/>
+        </w:rPr>
+        <w:t xml:space="preserve"> console </w:t>
+      </w:r>
+      <w:proofErr w:type="spellStart"/>
+      <w:r>
+        <w:rPr>
+          <w:bCs/>
+          <w:lang w:val="en-US"/>
+        </w:rPr>
+        <w:t>make:migration</w:t>
+      </w:r>
+      <w:proofErr w:type="spellEnd"/>
+    </w:p>
+    <w:p>
+      <w:pPr>
+        <w:spacing w:after="0"/>
+        <w:rPr>
+          <w:lang w:val="en-US"/>
+        </w:rPr>
+      </w:pPr>
+      <w:proofErr w:type="spellStart"/>
+      <w:proofErr w:type="gramStart"/>
+      <w:r>
+        <w:rPr>
+          <w:rStyle w:val="lev"/>
+          <w:rFonts w:ascii="Cambria" w:hAnsi="Cambria"/>
+          <w:color w:val="000000"/>
+          <w:sz w:val="27"/>
+          <w:szCs w:val="27"/>
+        </w:rPr>
+        <w:t>symfony</w:t>
+      </w:r>
+      <w:proofErr w:type="spellEnd"/>
+      <w:proofErr w:type="gramEnd"/>
+      <w:r>
+        <w:rPr>
+          <w:rStyle w:val="lev"/>
+          <w:rFonts w:ascii="Cambria" w:hAnsi="Cambria"/>
+          <w:color w:val="000000"/>
+          <w:sz w:val="27"/>
+          <w:szCs w:val="27"/>
+        </w:rPr>
+        <w:t xml:space="preserve"> console </w:t>
+      </w:r>
+      <w:proofErr w:type="spellStart"/>
+      <w:r>
+        <w:rPr>
+          <w:rStyle w:val="lev"/>
+          <w:rFonts w:ascii="Cambria" w:hAnsi="Cambria"/>
+          <w:color w:val="000000"/>
+          <w:sz w:val="27"/>
+          <w:szCs w:val="27"/>
+        </w:rPr>
+        <w:t>doctrine:migrations</w:t>
+      </w:r>
+      <w:proofErr w:type="spellEnd"/>
+      <w:r>
+        <w:rPr>
+          <w:rStyle w:val="lev"/>
+          <w:rFonts w:ascii="Cambria" w:hAnsi="Cambria"/>
+          <w:color w:val="000000"/>
+          <w:sz w:val="27"/>
+          <w:szCs w:val="27"/>
+        </w:rPr>
+        <w:t>:</w:t>
+      </w:r>
+      <w:proofErr w:type="spellStart"/>
+      <w:r>
+        <w:rPr>
+          <w:rStyle w:val="lev"/>
+          <w:rFonts w:ascii="Cambria" w:hAnsi="Cambria"/>
+          <w:color w:val="000000"/>
+          <w:sz w:val="27"/>
+          <w:szCs w:val="27"/>
+        </w:rPr>
+        <w:t>migrate</w:t>
+      </w:r>
+      <w:proofErr w:type="spellEnd"/>
     </w:p>
     <w:p>
       <w:pPr>
@@ -28627,6 +28783,7 @@
           <w:bCs/>
           <w:lang w:val="en-US"/>
         </w:rPr>
+        <w:lastRenderedPageBreak/>
         <w:t xml:space="preserve">      </w:t>
       </w:r>
       <w:proofErr w:type="spellStart"/>

</xml_diff>